<commit_message>
Use professional text label for speaker notes
</commit_message>
<xml_diff>
--- a/speech/vnot-v4.docx
+++ b/speech/vnot-v4.docx
@@ -8,7 +8,7 @@
         <w:keepNext/>
       </w:pPr>
       <w:r>
-        <w:t>Говорилка к презентации ВНОТ</w:t>
+        <w:t>Текст выступления ВНОТ</w:t>
       </w:r>
     </w:p>
     <w:p>
@@ -667,7 +667,7 @@
       <w:pStyle w:val="Header"/>
     </w:pPr>
     <w:r>
-      <w:t>ВНОТ 2026   Говорилка к версии 4</w:t>
+      <w:t>ВНОТ 2026   Текст выступления   Версия 4</w:t>
     </w:r>
   </w:p>
 </w:hdr>

</xml_diff>

<commit_message>
Remove slide QR codes and update speaker text
</commit_message>
<xml_diff>
--- a/speech/vnot-v4.docx
+++ b/speech/vnot-v4.docx
@@ -112,7 +112,7 @@
         <w:pStyle w:val="Подсказкадляпоказа"/>
       </w:pPr>
       <w:r>
-        <w:t>После стоп-кадра сделать следующий щелчок: откроется список восьми возможностей и QR-код страницы ЕПГУ.</w:t>
+        <w:t>После стоп-кадра сделать следующий щелчок: откроется список восьми возможностей.</w:t>
       </w:r>
     </w:p>
     <w:p>
@@ -136,7 +136,7 @@
         <w:keepLines/>
       </w:pPr>
       <w:r>
-        <w:t>В случаях, когда уведомление о проверке предусмотрено, оно направляется через Госуслуги. На экране есть QR-код: по нему можно открыть страницу с подробным описанием возможностей личного кабинета.</w:t>
+        <w:t>В случаях, когда уведомление о проверке предусмотрено, оно направляется через Госуслуги.</w:t>
       </w:r>
     </w:p>
     <w:p>
@@ -218,7 +218,7 @@
         <w:pStyle w:val="Подсказкадляпоказа"/>
       </w:pPr>
       <w:r>
-        <w:t>Оставить видимым QR-код портала на стоп-кадре.</w:t>
+        <w:t>Продолжать на стоп-кадре с заголовком портала.</w:t>
       </w:r>
     </w:p>
     <w:p>
@@ -242,7 +242,7 @@
         <w:keepLines/>
       </w:pPr>
       <w:r>
-        <w:t>QR-код на экране ведёт на портал. Можно открыть его и сохранить нужные материалы.</w:t>
+        <w:t>Адрес портала указан в заголовке: monitoring.gov.ru. Нужные материалы можно сохранить для дальнейшей работы.</w:t>
       </w:r>
     </w:p>
     <w:p>

</xml_diff>